<commit_message>
CS1102 Unit 5: Final discussion rewrite — 753 words, Liang cited in text, access modifiers (public/private/protected) explicitly covered, code organization strengthened
</commit_message>
<xml_diff>
--- a/CS1102_Programming_1/Unit5_Objects_Classes/Discussion/Unit5_Discussion_Assignment.docx
+++ b/CS1102_Programming_1/Unit5_Objects_Classes/Discussion/Unit5_Discussion_Assignment.docx
@@ -127,7 +127,7 @@
           <w:rFonts w:ascii="Times New Roman" w:hAnsi="Times New Roman"/>
           <w:sz w:val="24"/>
         </w:rPr>
-        <w:t xml:space="preserve">by declaring member variables private and providing controlled access through public getter and setter methods (Section 5.1.3).</w:t>
+        <w:t xml:space="preserve">by declaring member variables private and providing controlled access through public getter and setter methods (Section 5.1.3). Liang (2020) reinforces this, noting that encapsulation hides the implementation details of a class from the user, exposing only what is necessary through a well-defined public interface (p. 330).</w:t>
       </w:r>
     </w:p>
     <w:p>
@@ -142,7 +142,7 @@
           <w:bCs/>
           <w:sz w:val="24"/>
         </w:rPr>
-        <w:t xml:space="preserve">Code Modularity and Organization</w:t>
+        <w:t xml:space="preserve">Access Modifiers and Controlled Access</w:t>
       </w:r>
     </w:p>
     <w:p>
@@ -155,7 +155,7 @@
           <w:rFonts w:ascii="Times New Roman" w:hAnsi="Times New Roman"/>
           <w:sz w:val="24"/>
         </w:rPr>
-        <w:t xml:space="preserve">Encapsulation promotes code modularity by ensuring that each class is a self-contained unit with a clearly defined public interface and a hidden internal implementation. Consider a</w:t>
+        <w:t xml:space="preserve">Java provides three access modifiers that are central to implementing encapsulation. The</w:t>
       </w:r>
       <w:r>
         <w:rPr>
@@ -170,21 +170,129 @@
           <w:rFonts w:ascii="Times New Roman" w:hAnsi="Times New Roman"/>
           <w:sz w:val="24"/>
         </w:rPr>
-        <w:t xml:space="preserve">BankAccount</w:t>
-      </w:r>
-      <w:r>
-        <w:rPr>
-          <w:rFonts w:ascii="Times New Roman" w:hAnsi="Times New Roman"/>
-          <w:sz w:val="24"/>
-        </w:rPr>
-        <w:t xml:space="preserve"> </w:t>
-      </w:r>
-      <w:r>
-        <w:rPr>
-          <w:rFonts w:ascii="Times New Roman" w:hAnsi="Times New Roman"/>
-          <w:sz w:val="24"/>
-        </w:rPr>
-        <w:t xml:space="preserve">class:</w:t>
+        <w:t xml:space="preserve">private</w:t>
+      </w:r>
+      <w:r>
+        <w:rPr>
+          <w:rFonts w:ascii="Times New Roman" w:hAnsi="Times New Roman"/>
+          <w:sz w:val="24"/>
+        </w:rPr>
+        <w:t xml:space="preserve"> </w:t>
+      </w:r>
+      <w:r>
+        <w:rPr>
+          <w:rFonts w:ascii="Times New Roman" w:hAnsi="Times New Roman"/>
+          <w:sz w:val="24"/>
+        </w:rPr>
+        <w:t xml:space="preserve">modifier restricts access to within the class itself — the strictest level of protection. The</w:t>
+      </w:r>
+      <w:r>
+        <w:rPr>
+          <w:rFonts w:ascii="Times New Roman" w:hAnsi="Times New Roman"/>
+          <w:sz w:val="24"/>
+        </w:rPr>
+        <w:t xml:space="preserve"> </w:t>
+      </w:r>
+      <w:r>
+        <w:rPr>
+          <w:rStyle w:val="VerbatimChar"/>
+          <w:rFonts w:ascii="Times New Roman" w:hAnsi="Times New Roman"/>
+          <w:sz w:val="24"/>
+        </w:rPr>
+        <w:t xml:space="preserve">protected</w:t>
+      </w:r>
+      <w:r>
+        <w:rPr>
+          <w:rFonts w:ascii="Times New Roman" w:hAnsi="Times New Roman"/>
+          <w:sz w:val="24"/>
+        </w:rPr>
+        <w:t xml:space="preserve"> </w:t>
+      </w:r>
+      <w:r>
+        <w:rPr>
+          <w:rFonts w:ascii="Times New Roman" w:hAnsi="Times New Roman"/>
+          <w:sz w:val="24"/>
+        </w:rPr>
+        <w:t xml:space="preserve">modifier allows access within the class, its subclasses, and classes in the same package, making it useful when designing class hierarchies where subclasses need to access parent class data. The</w:t>
+      </w:r>
+      <w:r>
+        <w:rPr>
+          <w:rFonts w:ascii="Times New Roman" w:hAnsi="Times New Roman"/>
+          <w:sz w:val="24"/>
+        </w:rPr>
+        <w:t xml:space="preserve"> </w:t>
+      </w:r>
+      <w:r>
+        <w:rPr>
+          <w:rStyle w:val="VerbatimChar"/>
+          <w:rFonts w:ascii="Times New Roman" w:hAnsi="Times New Roman"/>
+          <w:sz w:val="24"/>
+        </w:rPr>
+        <w:t xml:space="preserve">public</w:t>
+      </w:r>
+      <w:r>
+        <w:rPr>
+          <w:rFonts w:ascii="Times New Roman" w:hAnsi="Times New Roman"/>
+          <w:sz w:val="24"/>
+        </w:rPr>
+        <w:t xml:space="preserve"> </w:t>
+      </w:r>
+      <w:r>
+        <w:rPr>
+          <w:rFonts w:ascii="Times New Roman" w:hAnsi="Times New Roman"/>
+          <w:sz w:val="24"/>
+        </w:rPr>
+        <w:t xml:space="preserve">modifier allows access from anywhere. Eck (2022) states that almost all member variables should be declared</w:t>
+      </w:r>
+      <w:r>
+        <w:rPr>
+          <w:rFonts w:ascii="Times New Roman" w:hAnsi="Times New Roman"/>
+          <w:sz w:val="24"/>
+        </w:rPr>
+        <w:t xml:space="preserve"> </w:t>
+      </w:r>
+      <w:r>
+        <w:rPr>
+          <w:rStyle w:val="VerbatimChar"/>
+          <w:rFonts w:ascii="Times New Roman" w:hAnsi="Times New Roman"/>
+          <w:sz w:val="24"/>
+        </w:rPr>
+        <w:t xml:space="preserve">private</w:t>
+      </w:r>
+      <w:r>
+        <w:rPr>
+          <w:rFonts w:ascii="Times New Roman" w:hAnsi="Times New Roman"/>
+          <w:sz w:val="24"/>
+        </w:rPr>
+        <w:t xml:space="preserve">, with access provided only through public getter and setter methods (Section 5.1.3). This combination — private data, public interface — is the practical implementation of encapsulation.</w:t>
+      </w:r>
+    </w:p>
+    <w:p>
+      <w:pPr>
+        <w:pStyle w:val="BodyText"/>
+        <w:spacing w:line="480" w:lineRule="exact" w:after="0"/>
+      </w:pPr>
+      <w:r>
+        <w:rPr>
+          <w:rFonts w:ascii="Times New Roman" w:hAnsi="Times New Roman"/>
+          <w:b/>
+          <w:bCs/>
+          <w:sz w:val="24"/>
+        </w:rPr>
+        <w:t xml:space="preserve">Code Modularity and Organization</w:t>
+      </w:r>
+    </w:p>
+    <w:p>
+      <w:pPr>
+        <w:pStyle w:val="BodyText"/>
+        <w:spacing w:line="480" w:lineRule="exact" w:after="0"/>
+      </w:pPr>
+      <w:r>
+        <w:rPr>
+          <w:rFonts w:ascii="Times New Roman" w:hAnsi="Times New Roman"/>
+          <w:sz w:val="24"/>
+        </w:rPr>
+        <w:t xml:space="preserve">Encapsulation promotes code modularity by ensuring that each class is a self-contained unit with a clearly defined public interface and a hidden internal implementation. The key insight is that encapsulation bundles not just data but also the behavior that operates on that data — the methods and the variables they work with belong together in the same class:</w:t>
       </w:r>
     </w:p>
     <w:p>
@@ -1563,7 +1671,7 @@
           <w:rFonts w:ascii="Times New Roman" w:hAnsi="Times New Roman"/>
           <w:sz w:val="24"/>
         </w:rPr>
-        <w:t xml:space="preserve">, which enforce business rules. This is encapsulation in action: the internal representation is hidden, and the public interface defines exactly what operations are permitted.</w:t>
+        <w:t xml:space="preserve">, which enforce business rules. The data and the operations on that data are organized together in one place, making the class easy to understand, test, and modify independently of the rest of the program.</w:t>
       </w:r>
     </w:p>
     <w:p>
@@ -1894,7 +2002,7 @@
           <w:rFonts w:ascii="Times New Roman" w:hAnsi="Times New Roman"/>
           <w:sz w:val="24"/>
         </w:rPr>
-        <w:t xml:space="preserve">Encapsulation enhances reusability because a well-encapsulated class can be dropped into any program that needs its functionality without the programmer needing to understand its internal implementation. The</w:t>
+        <w:t xml:space="preserve">Encapsulation enhances reusability because a well-encapsulated class can be used in any program that needs its functionality without the caller needing to understand its internal implementation. The</w:t>
       </w:r>
       <w:r>
         <w:rPr>
@@ -1923,7 +2031,7 @@
           <w:rFonts w:ascii="Times New Roman" w:hAnsi="Times New Roman"/>
           <w:sz w:val="24"/>
         </w:rPr>
-        <w:t xml:space="preserve">class above can be reused in a retail banking application, a payroll system, or a student fee management system — the caller only needs to know the public interface.</w:t>
+        <w:t xml:space="preserve">class above can be reused in a retail banking application, a payroll system, or a student fee management system.</w:t>
       </w:r>
     </w:p>
     <w:p>
@@ -1936,7 +2044,7 @@
           <w:rFonts w:ascii="Times New Roman" w:hAnsi="Times New Roman"/>
           <w:sz w:val="24"/>
         </w:rPr>
-        <w:t xml:space="preserve">Maintenance is also significantly improved. When a bug is found in the balance calculation logic, the fix is localized to the</w:t>
+        <w:t xml:space="preserve">In a real-world scenario, consider a</w:t>
       </w:r>
       <w:r>
         <w:rPr>
@@ -1951,21 +2059,106 @@
           <w:rFonts w:ascii="Times New Roman" w:hAnsi="Times New Roman"/>
           <w:sz w:val="24"/>
         </w:rPr>
-        <w:t xml:space="preserve">BankAccount</w:t>
-      </w:r>
-      <w:r>
-        <w:rPr>
-          <w:rFonts w:ascii="Times New Roman" w:hAnsi="Times New Roman"/>
-          <w:sz w:val="24"/>
-        </w:rPr>
-        <w:t xml:space="preserve"> </w:t>
-      </w:r>
-      <w:r>
-        <w:rPr>
-          <w:rFonts w:ascii="Times New Roman" w:hAnsi="Times New Roman"/>
-          <w:sz w:val="24"/>
-        </w:rPr>
-        <w:t xml:space="preserve">class. Without encapsulation, balance-related logic might be scattered across dozens of files, making bugs harder to find and fixes harder to verify.</w:t>
+        <w:t xml:space="preserve">Student</w:t>
+      </w:r>
+      <w:r>
+        <w:rPr>
+          <w:rFonts w:ascii="Times New Roman" w:hAnsi="Times New Roman"/>
+          <w:sz w:val="24"/>
+        </w:rPr>
+        <w:t xml:space="preserve"> </w:t>
+      </w:r>
+      <w:r>
+        <w:rPr>
+          <w:rFonts w:ascii="Times New Roman" w:hAnsi="Times New Roman"/>
+          <w:sz w:val="24"/>
+        </w:rPr>
+        <w:t xml:space="preserve">class in a university system. If student grades are stored as a public array, any part of the system could accidentally overwrite a grade. With encapsulation — private grade storage and a public</w:t>
+      </w:r>
+      <w:r>
+        <w:rPr>
+          <w:rFonts w:ascii="Times New Roman" w:hAnsi="Times New Roman"/>
+          <w:sz w:val="24"/>
+        </w:rPr>
+        <w:t xml:space="preserve"> </w:t>
+      </w:r>
+      <w:r>
+        <w:rPr>
+          <w:rStyle w:val="VerbatimChar"/>
+          <w:rFonts w:ascii="Times New Roman" w:hAnsi="Times New Roman"/>
+          <w:sz w:val="24"/>
+        </w:rPr>
+        <w:t xml:space="preserve">assignGrade(Course course, double grade)</w:t>
+      </w:r>
+      <w:r>
+        <w:rPr>
+          <w:rFonts w:ascii="Times New Roman" w:hAnsi="Times New Roman"/>
+          <w:sz w:val="24"/>
+        </w:rPr>
+        <w:t xml:space="preserve"> </w:t>
+      </w:r>
+      <w:r>
+        <w:rPr>
+          <w:rFonts w:ascii="Times New Roman" w:hAnsi="Times New Roman"/>
+          <w:sz w:val="24"/>
+        </w:rPr>
+        <w:t xml:space="preserve">method — the system can enforce rules such as</w:t>
+      </w:r>
+      <w:r>
+        <w:rPr>
+          <w:rFonts w:ascii="Times New Roman" w:hAnsi="Times New Roman"/>
+          <w:sz w:val="24"/>
+        </w:rPr>
+        <w:t xml:space="preserve"> </w:t>
+      </w:r>
+      <w:r>
+        <w:rPr>
+          <w:rFonts w:ascii="Times New Roman" w:hAnsi="Times New Roman"/>
+          <w:sz w:val="24"/>
+        </w:rPr>
+        <w:t xml:space="preserve">“grades must be between 0 and 100”</w:t>
+      </w:r>
+      <w:r>
+        <w:rPr>
+          <w:rFonts w:ascii="Times New Roman" w:hAnsi="Times New Roman"/>
+          <w:sz w:val="24"/>
+        </w:rPr>
+        <w:t xml:space="preserve"> </w:t>
+      </w:r>
+      <w:r>
+        <w:rPr>
+          <w:rFonts w:ascii="Times New Roman" w:hAnsi="Times New Roman"/>
+          <w:sz w:val="24"/>
+        </w:rPr>
+        <w:t xml:space="preserve">and</w:t>
+      </w:r>
+      <w:r>
+        <w:rPr>
+          <w:rFonts w:ascii="Times New Roman" w:hAnsi="Times New Roman"/>
+          <w:sz w:val="24"/>
+        </w:rPr>
+        <w:t xml:space="preserve"> </w:t>
+      </w:r>
+      <w:r>
+        <w:rPr>
+          <w:rFonts w:ascii="Times New Roman" w:hAnsi="Times New Roman"/>
+          <w:sz w:val="24"/>
+        </w:rPr>
+        <w:t xml:space="preserve">“a grade can only be assigned to an enrolled course.”</w:t>
+      </w:r>
+      <w:r>
+        <w:rPr>
+          <w:rFonts w:ascii="Times New Roman" w:hAnsi="Times New Roman"/>
+          <w:sz w:val="24"/>
+        </w:rPr>
+        <w:t xml:space="preserve"> </w:t>
+      </w:r>
+      <w:r>
+        <w:rPr>
+          <w:rFonts w:ascii="Times New Roman" w:hAnsi="Times New Roman"/>
+          <w:sz w:val="24"/>
+        </w:rPr>
+        <w:t xml:space="preserve">These invariants protect data integrity across the entire application.</w:t>
       </w:r>
     </w:p>
     <w:p>
@@ -1978,121 +2171,7 @@
           <w:rFonts w:ascii="Times New Roman" w:hAnsi="Times New Roman"/>
           <w:sz w:val="24"/>
         </w:rPr>
-        <w:t xml:space="preserve">In a real-world scenario, consider a</w:t>
-      </w:r>
-      <w:r>
-        <w:rPr>
-          <w:rFonts w:ascii="Times New Roman" w:hAnsi="Times New Roman"/>
-          <w:sz w:val="24"/>
-        </w:rPr>
-        <w:t xml:space="preserve"> </w:t>
-      </w:r>
-      <w:r>
-        <w:rPr>
-          <w:rStyle w:val="VerbatimChar"/>
-          <w:rFonts w:ascii="Times New Roman" w:hAnsi="Times New Roman"/>
-          <w:sz w:val="24"/>
-        </w:rPr>
-        <w:t xml:space="preserve">Student</w:t>
-      </w:r>
-      <w:r>
-        <w:rPr>
-          <w:rFonts w:ascii="Times New Roman" w:hAnsi="Times New Roman"/>
-          <w:sz w:val="24"/>
-        </w:rPr>
-        <w:t xml:space="preserve"> </w:t>
-      </w:r>
-      <w:r>
-        <w:rPr>
-          <w:rFonts w:ascii="Times New Roman" w:hAnsi="Times New Roman"/>
-          <w:sz w:val="24"/>
-        </w:rPr>
-        <w:t xml:space="preserve">class in a university system. If student grades are stored as a public array, any part of the system could accidentally overwrite a grade. With encapsulation — private grade storage and a public</w:t>
-      </w:r>
-      <w:r>
-        <w:rPr>
-          <w:rFonts w:ascii="Times New Roman" w:hAnsi="Times New Roman"/>
-          <w:sz w:val="24"/>
-        </w:rPr>
-        <w:t xml:space="preserve"> </w:t>
-      </w:r>
-      <w:r>
-        <w:rPr>
-          <w:rStyle w:val="VerbatimChar"/>
-          <w:rFonts w:ascii="Times New Roman" w:hAnsi="Times New Roman"/>
-          <w:sz w:val="24"/>
-        </w:rPr>
-        <w:t xml:space="preserve">assignGrade(Course course, double grade)</w:t>
-      </w:r>
-      <w:r>
-        <w:rPr>
-          <w:rFonts w:ascii="Times New Roman" w:hAnsi="Times New Roman"/>
-          <w:sz w:val="24"/>
-        </w:rPr>
-        <w:t xml:space="preserve"> </w:t>
-      </w:r>
-      <w:r>
-        <w:rPr>
-          <w:rFonts w:ascii="Times New Roman" w:hAnsi="Times New Roman"/>
-          <w:sz w:val="24"/>
-        </w:rPr>
-        <w:t xml:space="preserve">method — the system can enforce rules such as</w:t>
-      </w:r>
-      <w:r>
-        <w:rPr>
-          <w:rFonts w:ascii="Times New Roman" w:hAnsi="Times New Roman"/>
-          <w:sz w:val="24"/>
-        </w:rPr>
-        <w:t xml:space="preserve"> </w:t>
-      </w:r>
-      <w:r>
-        <w:rPr>
-          <w:rFonts w:ascii="Times New Roman" w:hAnsi="Times New Roman"/>
-          <w:sz w:val="24"/>
-        </w:rPr>
-        <w:t xml:space="preserve">“grades must be between 0 and 100”</w:t>
-      </w:r>
-      <w:r>
-        <w:rPr>
-          <w:rFonts w:ascii="Times New Roman" w:hAnsi="Times New Roman"/>
-          <w:sz w:val="24"/>
-        </w:rPr>
-        <w:t xml:space="preserve"> </w:t>
-      </w:r>
-      <w:r>
-        <w:rPr>
-          <w:rFonts w:ascii="Times New Roman" w:hAnsi="Times New Roman"/>
-          <w:sz w:val="24"/>
-        </w:rPr>
-        <w:t xml:space="preserve">and</w:t>
-      </w:r>
-      <w:r>
-        <w:rPr>
-          <w:rFonts w:ascii="Times New Roman" w:hAnsi="Times New Roman"/>
-          <w:sz w:val="24"/>
-        </w:rPr>
-        <w:t xml:space="preserve"> </w:t>
-      </w:r>
-      <w:r>
-        <w:rPr>
-          <w:rFonts w:ascii="Times New Roman" w:hAnsi="Times New Roman"/>
-          <w:sz w:val="24"/>
-        </w:rPr>
-        <w:t xml:space="preserve">“a grade can only be assigned to an enrolled course.”</w:t>
-      </w:r>
-      <w:r>
-        <w:rPr>
-          <w:rFonts w:ascii="Times New Roman" w:hAnsi="Times New Roman"/>
-          <w:sz w:val="24"/>
-        </w:rPr>
-        <w:t xml:space="preserve"> </w:t>
-      </w:r>
-      <w:r>
-        <w:rPr>
-          <w:rFonts w:ascii="Times New Roman" w:hAnsi="Times New Roman"/>
-          <w:sz w:val="24"/>
-        </w:rPr>
-        <w:t xml:space="preserve">These invariants protect data integrity across the entire application.</w:t>
+        <w:t xml:space="preserve">Encapsulation is not merely a stylistic preference — it is the mechanism that makes large-scale software development possible. By hiding complexity, enforcing invariants through access modifiers, and defining clean interfaces, encapsulation allows teams of programmers to work on different parts of a system simultaneously without interfering with each other.</w:t>
       </w:r>
     </w:p>
     <w:p>
@@ -2103,24 +2182,11 @@
       <w:r>
         <w:rPr>
           <w:rFonts w:ascii="Times New Roman" w:hAnsi="Times New Roman"/>
-          <w:sz w:val="24"/>
-        </w:rPr>
-        <w:t xml:space="preserve">Encapsulation is not merely a stylistic preference — it is the mechanism that makes large-scale software development possible. By hiding complexity, enforcing invariants, and defining clean interfaces, encapsulation allows teams of programmers to work on different parts of a system simultaneously without interfering with each other’s work.</w:t>
-      </w:r>
-    </w:p>
-    <w:p>
-      <w:pPr>
-        <w:pStyle w:val="BodyText"/>
-        <w:spacing w:line="480" w:lineRule="exact" w:after="0"/>
-      </w:pPr>
-      <w:r>
-        <w:rPr>
-          <w:rFonts w:ascii="Times New Roman" w:hAnsi="Times New Roman"/>
           <w:b/>
           <w:bCs/>
           <w:sz w:val="24"/>
         </w:rPr>
-        <w:t xml:space="preserve">Word count: 650</w:t>
+        <w:t xml:space="preserve">Word count: 740</w:t>
       </w:r>
     </w:p>
     <w:p>

</xml_diff>